<commit_message>
Offer a one-third UMass Amherst default for college costs
The education question asked whether to split costs evenly but printed an
ability-to-pay clause. Per the clinic faculty, the default is now that each
parent pays one-third of the then cost of attending UMass Amherst, with
ability to pay, an even split or other terms as alternatives. Cost follows
the 2025 Child Support Guidelines, Section II.G (mandatory fees, tuition,
housing, meal plan and books).

Fixes #26

Co-Authored-By: Claude Opus 5.5 (1M context) <noreply@anthropic.com>
</commit_message>
<xml_diff>
--- a/docassemble/MATCSeparationAgreement/data/templates/a_divorce_agreement.docx
+++ b/docassemble/MATCSeparationAgreement/data/templates/a_divorce_agreement.docx
@@ -9432,6 +9432,120 @@
           <w:sz w:val="24"/>
           <w:szCs w:val="24"/>
         </w:rPr>
+        <w:t>{%p if education_cost_umass_third %}</w:t>
+      </w:r>
+    </w:p>
+    <w:p>
+      <w:pPr>
+        <w:spacing w:after="0" w:line="276" w:lineRule="auto"/>
+        <w:jc w:val="both"/>
+        <w:rPr>
+          <w:rFonts w:ascii="Times New Roman" w:hAnsi="Times New Roman" w:cs="Times New Roman"/>
+          <w:sz w:val="24"/>
+          <w:szCs w:val="24"/>
+        </w:rPr>
+      </w:pPr>
+      <w:r>
+        <w:rPr>
+          <w:rFonts w:ascii="Times New Roman" w:hAnsi="Times New Roman" w:cs="Times New Roman"/>
+          <w:sz w:val="24"/>
+          <w:szCs w:val="24"/>
+        </w:rPr>
+        <w:t>The parties agree that if their child(ren) attend college or trade school after high school, each party shall pay one-third (1/3) of the then cost of attending the University of Massachusetts Amherst as an in-state undergraduate, meaning its mandatory fees, tuition, housing, meal plan, and books.</w:t>
+      </w:r>
+    </w:p>
+    <w:p>
+      <w:pPr>
+        <w:spacing w:after="0" w:line="276" w:lineRule="auto"/>
+        <w:jc w:val="both"/>
+        <w:rPr>
+          <w:rFonts w:ascii="Times New Roman" w:hAnsi="Times New Roman" w:cs="Times New Roman"/>
+          <w:sz w:val="24"/>
+          <w:szCs w:val="24"/>
+        </w:rPr>
+      </w:pPr>
+      <w:r>
+        <w:rPr>
+          <w:rFonts w:ascii="Times New Roman" w:hAnsi="Times New Roman" w:cs="Times New Roman"/>
+          <w:sz w:val="24"/>
+          <w:szCs w:val="24"/>
+        </w:rPr>
+        <w:t>{%p endif %}</w:t>
+      </w:r>
+    </w:p>
+    <w:p>
+      <w:pPr>
+        <w:spacing w:after="0" w:line="276" w:lineRule="auto"/>
+        <w:jc w:val="both"/>
+        <w:rPr>
+          <w:rFonts w:ascii="Times New Roman" w:hAnsi="Times New Roman" w:cs="Times New Roman"/>
+          <w:sz w:val="24"/>
+          <w:szCs w:val="24"/>
+        </w:rPr>
+      </w:pPr>
+      <w:r>
+        <w:rPr>
+          <w:rFonts w:ascii="Times New Roman" w:hAnsi="Times New Roman" w:cs="Times New Roman"/>
+          <w:sz w:val="24"/>
+          <w:szCs w:val="24"/>
+        </w:rPr>
+        <w:t>{%p if education_cost_even %}</w:t>
+      </w:r>
+    </w:p>
+    <w:p>
+      <w:pPr>
+        <w:spacing w:after="0" w:line="276" w:lineRule="auto"/>
+        <w:jc w:val="both"/>
+        <w:rPr>
+          <w:rFonts w:ascii="Times New Roman" w:hAnsi="Times New Roman" w:cs="Times New Roman"/>
+          <w:sz w:val="24"/>
+          <w:szCs w:val="24"/>
+        </w:rPr>
+      </w:pPr>
+      <w:r>
+        <w:rPr>
+          <w:rFonts w:ascii="Times New Roman" w:hAnsi="Times New Roman" w:cs="Times New Roman"/>
+          <w:sz w:val="24"/>
+          <w:szCs w:val="24"/>
+        </w:rPr>
+        <w:t>The parties agree that if their child(ren) attend college or trade school after high school, each party shall pay one-half (1/2) of the cost.</w:t>
+      </w:r>
+    </w:p>
+    <w:p>
+      <w:pPr>
+        <w:spacing w:after="0" w:line="276" w:lineRule="auto"/>
+        <w:jc w:val="both"/>
+        <w:rPr>
+          <w:rFonts w:ascii="Times New Roman" w:hAnsi="Times New Roman" w:cs="Times New Roman"/>
+          <w:sz w:val="24"/>
+          <w:szCs w:val="24"/>
+        </w:rPr>
+      </w:pPr>
+      <w:r>
+        <w:rPr>
+          <w:rFonts w:ascii="Times New Roman" w:hAnsi="Times New Roman" w:cs="Times New Roman"/>
+          <w:sz w:val="24"/>
+          <w:szCs w:val="24"/>
+        </w:rPr>
+        <w:t>{%p endif %}</w:t>
+      </w:r>
+    </w:p>
+    <w:p>
+      <w:pPr>
+        <w:spacing w:after="0" w:line="276" w:lineRule="auto"/>
+        <w:jc w:val="both"/>
+        <w:rPr>
+          <w:rFonts w:ascii="Times New Roman" w:hAnsi="Times New Roman" w:cs="Times New Roman"/>
+          <w:sz w:val="24"/>
+          <w:szCs w:val="24"/>
+        </w:rPr>
+      </w:pPr>
+      <w:r>
+        <w:rPr>
+          <w:rFonts w:ascii="Times New Roman" w:hAnsi="Times New Roman" w:cs="Times New Roman"/>
+          <w:sz w:val="24"/>
+          <w:szCs w:val="24"/>
+        </w:rPr>
         <w:t>{%p if education_cost_based_on_ability %}</w:t>
       </w:r>
     </w:p>
@@ -9521,7 +9635,7 @@
           <w:sz w:val="24"/>
           <w:szCs w:val="24"/>
         </w:rPr>
-        <w:t xml:space="preserve">The parties agree to divide the cost of college and trade school post high school as follows:  </w:t>
+        <w:t xml:space="preserve">{% if education_cost_other %}The parties agree to divide the cost of college and trade school post high school as follows:{% else %}The parties further agree that:{% endif %}  </w:t>
       </w:r>
     </w:p>
     <w:p>

</xml_diff>

<commit_message>
Require a parenting time schedule and a fallback
Per the clinic faculty, the agreement must have a specific parenting time
plan. Spouses may agree to work it out together, but they also need a set
schedule that applies when they cannot agree. The No path is removed, and
Exhibit H prints both the schedule and the fallback.

The additional custody terms question now comes after parenting time, with
examples, since it covers both topics (part of 1A#198).

Fixes #31

Co-Authored-By: Claude Opus 5.5 (1M context) <noreply@anthropic.com>
</commit_message>
<xml_diff>
--- a/docassemble/MATCSeparationAgreement/data/templates/a_divorce_agreement.docx
+++ b/docassemble/MATCSeparationAgreement/data/templates/a_divorce_agreement.docx
@@ -8053,8 +8053,23 @@
           <w:sz w:val="24"/>
           <w:szCs w:val="24"/>
         </w:rPr>
-        <w:t xml:space="preserve">The parties agree that </w:t>
-      </w:r>
+        <w:t xml:space="preserve">The parties agree to the following parenting time schedule for the minor child(ren):  </w:t>
+      </w:r>
+      <w:proofErr w:type="gramStart"/>
+      <w:proofErr w:type="gramEnd"/>
+      <w:proofErr w:type="gramStart"/>
+      <w:proofErr w:type="gramEnd"/>
+    </w:p>
+    <w:p>
+      <w:pPr>
+        <w:spacing w:after="0" w:line="276" w:lineRule="auto"/>
+        <w:jc w:val="both"/>
+        <w:rPr>
+          <w:rFonts w:ascii="Times New Roman" w:hAnsi="Times New Roman" w:cs="Times New Roman"/>
+          <w:sz w:val="24"/>
+          <w:szCs w:val="24"/>
+        </w:rPr>
+      </w:pPr>
       <w:proofErr w:type="gramStart"/>
       <w:r>
         <w:rPr>
@@ -8080,61 +8095,6 @@
           <w:sz w:val="24"/>
           <w:szCs w:val="24"/>
         </w:rPr>
-        <w:t>recipient }</w:t>
-      </w:r>
-      <w:proofErr w:type="gramEnd"/>
-      <w:r>
-        <w:rPr>
-          <w:rFonts w:ascii="Times New Roman" w:hAnsi="Times New Roman" w:cs="Times New Roman"/>
-          <w:sz w:val="24"/>
-          <w:szCs w:val="24"/>
-        </w:rPr>
-        <w:t xml:space="preserve">} </w:t>
-      </w:r>
-      <w:r>
-        <w:rPr>
-          <w:rFonts w:ascii="Times New Roman" w:hAnsi="Times New Roman" w:cs="Times New Roman"/>
-          <w:sz w:val="24"/>
-          <w:szCs w:val="24"/>
-        </w:rPr>
-        <w:t xml:space="preserve">shall have the following parenting time with the minor child(ren):  </w:t>
-      </w:r>
-    </w:p>
-    <w:p>
-      <w:pPr>
-        <w:spacing w:after="0" w:line="276" w:lineRule="auto"/>
-        <w:jc w:val="both"/>
-        <w:rPr>
-          <w:rFonts w:ascii="Times New Roman" w:hAnsi="Times New Roman" w:cs="Times New Roman"/>
-          <w:sz w:val="24"/>
-          <w:szCs w:val="24"/>
-        </w:rPr>
-      </w:pPr>
-      <w:proofErr w:type="gramStart"/>
-      <w:r>
-        <w:rPr>
-          <w:rFonts w:ascii="Times New Roman" w:hAnsi="Times New Roman" w:cs="Times New Roman"/>
-          <w:sz w:val="24"/>
-          <w:szCs w:val="24"/>
-        </w:rPr>
-        <w:t>{{ parenting</w:t>
-      </w:r>
-      <w:proofErr w:type="gramEnd"/>
-      <w:r>
-        <w:rPr>
-          <w:rFonts w:ascii="Times New Roman" w:hAnsi="Times New Roman" w:cs="Times New Roman"/>
-          <w:sz w:val="24"/>
-          <w:szCs w:val="24"/>
-        </w:rPr>
-        <w:t>_time_</w:t>
-      </w:r>
-      <w:proofErr w:type="gramStart"/>
-      <w:r>
-        <w:rPr>
-          <w:rFonts w:ascii="Times New Roman" w:hAnsi="Times New Roman" w:cs="Times New Roman"/>
-          <w:sz w:val="24"/>
-          <w:szCs w:val="24"/>
-        </w:rPr>
         <w:t>description }</w:t>
       </w:r>
       <w:proofErr w:type="gramEnd"/>
@@ -8146,6 +8106,52 @@
         </w:rPr>
         <w:t>}</w:t>
       </w:r>
+    </w:p>
+    <w:p>
+      <w:pPr>
+        <w:spacing w:after="0" w:line="276" w:lineRule="auto"/>
+        <w:jc w:val="both"/>
+        <w:rPr>
+          <w:rFonts w:ascii="Times New Roman" w:hAnsi="Times New Roman" w:cs="Times New Roman"/>
+          <w:sz w:val="24"/>
+          <w:szCs w:val="24"/>
+        </w:rPr>
+      </w:pPr>
+      <w:proofErr w:type="gramStart"/>
+      <w:r>
+        <w:rPr>
+          <w:rFonts w:ascii="Times New Roman" w:hAnsi="Times New Roman" w:cs="Times New Roman"/>
+          <w:sz w:val="24"/>
+          <w:szCs w:val="24"/>
+        </w:rPr>
+        <w:t xml:space="preserve">If the parties cannot agree on parenting time, the following schedule shall apply:  </w:t>
+      </w:r>
+      <w:proofErr w:type="gramEnd"/>
+      <w:proofErr w:type="gramStart"/>
+      <w:proofErr w:type="gramEnd"/>
+    </w:p>
+    <w:p>
+      <w:pPr>
+        <w:spacing w:after="0" w:line="276" w:lineRule="auto"/>
+        <w:jc w:val="both"/>
+        <w:rPr>
+          <w:rFonts w:ascii="Times New Roman" w:hAnsi="Times New Roman" w:cs="Times New Roman"/>
+          <w:sz w:val="24"/>
+          <w:szCs w:val="24"/>
+        </w:rPr>
+      </w:pPr>
+      <w:proofErr w:type="gramStart"/>
+      <w:r>
+        <w:rPr>
+          <w:rFonts w:ascii="Times New Roman" w:hAnsi="Times New Roman" w:cs="Times New Roman"/>
+          <w:sz w:val="24"/>
+          <w:szCs w:val="24"/>
+        </w:rPr>
+        <w:t>{{ parenting_time_fallback }}</w:t>
+      </w:r>
+      <w:proofErr w:type="gramEnd"/>
+      <w:proofErr w:type="gramStart"/>
+      <w:proofErr w:type="gramEnd"/>
     </w:p>
     <w:p>
       <w:pPr>

</xml_diff>

<commit_message>
Ask which children still get child support under G.L. c. 208, § 28
Nothing checked a child's age, so a child over 23 still got the child
support questions. Each child's support eligibility now follows § 28: under
18 counts; 18 to 20 counts if the child lives with and depends mainly on a
parent; 21 and 22 count only if that dependence is due to enrollment in an
educational program, up to an undergraduate degree; 23 and older does not.
Exhibit I names the children covered, or says that none are eligible.

Also fixes the end-of-support clause, which compared against "child" while
the interview stores "each child individually", so it always printed
"youngest child".

Part of #32

Co-Authored-By: Claude Opus 5.5 (1M context) <noreply@anthropic.com>
</commit_message>
<xml_diff>
--- a/docassemble/MATCSeparationAgreement/data/templates/a_divorce_agreement.docx
+++ b/docassemble/MATCSeparationAgreement/data/templates/a_divorce_agreement.docx
@@ -8362,6 +8362,120 @@
           <w:sz w:val="24"/>
           <w:szCs w:val="24"/>
         </w:rPr>
+        <w:t>{%p if not sa_support_children %}</w:t>
+      </w:r>
+    </w:p>
+    <w:p>
+      <w:pPr>
+        <w:spacing w:after="0" w:line="276" w:lineRule="auto"/>
+        <w:jc w:val="both"/>
+        <w:rPr>
+          <w:rFonts w:ascii="Times New Roman" w:hAnsi="Times New Roman" w:cs="Times New Roman"/>
+          <w:sz w:val="24"/>
+          <w:szCs w:val="24"/>
+        </w:rPr>
+      </w:pPr>
+      <w:r>
+        <w:rPr>
+          <w:rFonts w:ascii="Times New Roman" w:hAnsi="Times New Roman" w:cs="Times New Roman"/>
+          <w:sz w:val="24"/>
+          <w:szCs w:val="24"/>
+        </w:rPr>
+        <w:t>No child support is payable under this Agreement because no child of the parties is eligible for support under G. L. c. 208, § 28.</w:t>
+      </w:r>
+    </w:p>
+    <w:p>
+      <w:pPr>
+        <w:spacing w:after="0" w:line="276" w:lineRule="auto"/>
+        <w:jc w:val="both"/>
+        <w:rPr>
+          <w:rFonts w:ascii="Times New Roman" w:hAnsi="Times New Roman" w:cs="Times New Roman"/>
+          <w:sz w:val="24"/>
+          <w:szCs w:val="24"/>
+        </w:rPr>
+      </w:pPr>
+      <w:r>
+        <w:rPr>
+          <w:rFonts w:ascii="Times New Roman" w:hAnsi="Times New Roman" w:cs="Times New Roman"/>
+          <w:sz w:val="24"/>
+          <w:szCs w:val="24"/>
+        </w:rPr>
+        <w:t>{%p endif %}</w:t>
+      </w:r>
+    </w:p>
+    <w:p>
+      <w:pPr>
+        <w:spacing w:after="0" w:line="276" w:lineRule="auto"/>
+        <w:jc w:val="both"/>
+        <w:rPr>
+          <w:rFonts w:ascii="Times New Roman" w:hAnsi="Times New Roman" w:cs="Times New Roman"/>
+          <w:sz w:val="24"/>
+          <w:szCs w:val="24"/>
+        </w:rPr>
+      </w:pPr>
+      <w:r>
+        <w:rPr>
+          <w:rFonts w:ascii="Times New Roman" w:hAnsi="Times New Roman" w:cs="Times New Roman"/>
+          <w:sz w:val="24"/>
+          <w:szCs w:val="24"/>
+        </w:rPr>
+        <w:t>{%p if sa_support_children and sa_no_support_children %}</w:t>
+      </w:r>
+    </w:p>
+    <w:p>
+      <w:pPr>
+        <w:spacing w:after="0" w:line="276" w:lineRule="auto"/>
+        <w:jc w:val="both"/>
+        <w:rPr>
+          <w:rFonts w:ascii="Times New Roman" w:hAnsi="Times New Roman" w:cs="Times New Roman"/>
+          <w:sz w:val="24"/>
+          <w:szCs w:val="24"/>
+        </w:rPr>
+      </w:pPr>
+      <w:r>
+        <w:rPr>
+          <w:rFonts w:ascii="Times New Roman" w:hAnsi="Times New Roman" w:cs="Times New Roman"/>
+          <w:sz w:val="24"/>
+          <w:szCs w:val="24"/>
+        </w:rPr>
+        <w:t>Child support under this Exhibit is for {{ comma_and_list(sa_support_children) }}. No child support is payable for {{ comma_and_list(sa_no_support_children) }}, {% if sa_no_support_children | length &gt; 1 %}who are{% else %}who is{% endif %} not eligible for support under G. L. c. 208, § 28.</w:t>
+      </w:r>
+    </w:p>
+    <w:p>
+      <w:pPr>
+        <w:spacing w:after="0" w:line="276" w:lineRule="auto"/>
+        <w:jc w:val="both"/>
+        <w:rPr>
+          <w:rFonts w:ascii="Times New Roman" w:hAnsi="Times New Roman" w:cs="Times New Roman"/>
+          <w:sz w:val="24"/>
+          <w:szCs w:val="24"/>
+        </w:rPr>
+      </w:pPr>
+      <w:r>
+        <w:rPr>
+          <w:rFonts w:ascii="Times New Roman" w:hAnsi="Times New Roman" w:cs="Times New Roman"/>
+          <w:sz w:val="24"/>
+          <w:szCs w:val="24"/>
+        </w:rPr>
+        <w:t>{%p endif %}</w:t>
+      </w:r>
+    </w:p>
+    <w:p>
+      <w:pPr>
+        <w:spacing w:after="0" w:line="276" w:lineRule="auto"/>
+        <w:jc w:val="both"/>
+        <w:rPr>
+          <w:rFonts w:ascii="Times New Roman" w:hAnsi="Times New Roman" w:cs="Times New Roman"/>
+          <w:sz w:val="24"/>
+          <w:szCs w:val="24"/>
+        </w:rPr>
+      </w:pPr>
+      <w:r>
+        <w:rPr>
+          <w:rFonts w:ascii="Times New Roman" w:hAnsi="Times New Roman" w:cs="Times New Roman"/>
+          <w:sz w:val="24"/>
+          <w:szCs w:val="24"/>
+        </w:rPr>
         <w:t>{%p if child_support_wage_assignment %}</w:t>
       </w:r>
     </w:p>
@@ -8966,125 +9080,18 @@
           <w:sz w:val="24"/>
           <w:szCs w:val="24"/>
         </w:rPr>
-        <w:t xml:space="preserve">The obligation to pay current child support ends on the 21st birthday of </w:t>
-      </w:r>
-      <w:proofErr w:type="gramStart"/>
-      <w:r>
-        <w:rPr>
-          <w:rFonts w:ascii="Times New Roman" w:hAnsi="Times New Roman" w:cs="Times New Roman"/>
-          <w:color w:val="000000" w:themeColor="text1"/>
-          <w:sz w:val="24"/>
-          <w:szCs w:val="24"/>
-        </w:rPr>
-        <w:t xml:space="preserve">the </w:t>
-      </w:r>
-      <w:r>
-        <w:rPr>
-          <w:rFonts w:ascii="Times New Roman" w:hAnsi="Times New Roman" w:cs="Times New Roman"/>
-          <w:sz w:val="24"/>
-          <w:szCs w:val="24"/>
-        </w:rPr>
-        <w:t>{%</w:t>
-      </w:r>
-      <w:proofErr w:type="gramEnd"/>
-      <w:r>
-        <w:rPr>
-          <w:rFonts w:ascii="Times New Roman" w:hAnsi="Times New Roman" w:cs="Times New Roman"/>
-          <w:sz w:val="24"/>
-          <w:szCs w:val="24"/>
-        </w:rPr>
-        <w:t xml:space="preserve"> if child_support_applies_to == "child" </w:t>
-      </w:r>
-      <w:proofErr w:type="gramStart"/>
-      <w:r>
-        <w:rPr>
-          <w:rFonts w:ascii="Times New Roman" w:hAnsi="Times New Roman" w:cs="Times New Roman"/>
-          <w:sz w:val="24"/>
-          <w:szCs w:val="24"/>
-        </w:rPr>
-        <w:t>%}child</w:t>
-      </w:r>
-      <w:proofErr w:type="gramEnd"/>
-      <w:r>
-        <w:rPr>
-          <w:rFonts w:ascii="Times New Roman" w:hAnsi="Times New Roman" w:cs="Times New Roman"/>
-          <w:sz w:val="24"/>
-          <w:szCs w:val="24"/>
-        </w:rPr>
-        <w:t xml:space="preserve">{% else </w:t>
-      </w:r>
-      <w:proofErr w:type="gramStart"/>
-      <w:r>
-        <w:rPr>
-          <w:rFonts w:ascii="Times New Roman" w:hAnsi="Times New Roman" w:cs="Times New Roman"/>
-          <w:sz w:val="24"/>
-          <w:szCs w:val="24"/>
-        </w:rPr>
-        <w:t>%}youngest</w:t>
-      </w:r>
-      <w:proofErr w:type="gramEnd"/>
-      <w:r>
-        <w:rPr>
-          <w:rFonts w:ascii="Times New Roman" w:hAnsi="Times New Roman" w:cs="Times New Roman"/>
-          <w:sz w:val="24"/>
-          <w:szCs w:val="24"/>
-        </w:rPr>
-        <w:t xml:space="preserve"> </w:t>
-      </w:r>
-      <w:proofErr w:type="gramStart"/>
-      <w:r>
-        <w:rPr>
-          <w:rFonts w:ascii="Times New Roman" w:hAnsi="Times New Roman" w:cs="Times New Roman"/>
-          <w:sz w:val="24"/>
-          <w:szCs w:val="24"/>
-        </w:rPr>
-        <w:t>child{</w:t>
-      </w:r>
-      <w:proofErr w:type="gramEnd"/>
-      <w:r>
-        <w:rPr>
-          <w:rFonts w:ascii="Times New Roman" w:hAnsi="Times New Roman" w:cs="Times New Roman"/>
-          <w:sz w:val="24"/>
-          <w:szCs w:val="24"/>
-        </w:rPr>
-        <w:t xml:space="preserve">% </w:t>
-      </w:r>
-      <w:proofErr w:type="gramStart"/>
-      <w:r>
-        <w:rPr>
-          <w:rFonts w:ascii="Times New Roman" w:hAnsi="Times New Roman" w:cs="Times New Roman"/>
-          <w:sz w:val="24"/>
-          <w:szCs w:val="24"/>
-        </w:rPr>
-        <w:t>endif %}</w:t>
-      </w:r>
-      <w:proofErr w:type="gramEnd"/>
-      <w:r>
-        <w:rPr>
-          <w:rFonts w:ascii="Times New Roman" w:hAnsi="Times New Roman" w:cs="Times New Roman"/>
-          <w:color w:val="000000" w:themeColor="text1"/>
-          <w:sz w:val="24"/>
-          <w:szCs w:val="24"/>
-        </w:rPr>
-        <w:t>,</w:t>
-      </w:r>
-      <w:r>
-        <w:rPr>
-          <w:rFonts w:ascii="Times New Roman" w:hAnsi="Times New Roman" w:cs="Times New Roman"/>
-          <w:sz w:val="24"/>
-          <w:szCs w:val="24"/>
-        </w:rPr>
-        <w:t xml:space="preserve"> </w:t>
-      </w:r>
-      <w:r>
-        <w:rPr>
-          <w:rFonts w:ascii="Times New Roman" w:hAnsi="Times New Roman" w:cs="Times New Roman"/>
-          <w:color w:val="000000" w:themeColor="text1"/>
-          <w:sz w:val="24"/>
-          <w:szCs w:val="24"/>
-        </w:rPr>
-        <w:t>unless otherwise ordered by the Court.</w:t>
-      </w:r>
+        <w:t>The obligation to pay current child support ends on the 21st birthday of the {% if child_support_applies_to == "each child individually" %}child{% else %}youngest child{% endif %}, unless otherwise ordered by the Court.</w:t>
+      </w:r>
+      <w:proofErr w:type="gramStart"/>
+      <w:proofErr w:type="gramEnd"/>
+      <w:proofErr w:type="gramStart"/>
+      <w:proofErr w:type="gramEnd"/>
+      <w:proofErr w:type="gramStart"/>
+      <w:proofErr w:type="gramEnd"/>
+      <w:proofErr w:type="gramStart"/>
+      <w:proofErr w:type="gramEnd"/>
+      <w:proofErr w:type="gramStart"/>
+      <w:proofErr w:type="gramEnd"/>
     </w:p>
     <w:p>
       <w:pPr>

</xml_diff>

<commit_message>
Say in the agreement whether each party has a lawyer
Per the clinic faculty, a lawyer does not need notice or sign-off, but the
agreement should say whether each party is represented and give the
lawyer's name and address. Only the parties sign. The standalone interview
asks; the combined 1A interview supplies the answers it already has.

Fixes #33

Co-Authored-By: Claude Opus 5.5 (1M context) <noreply@anthropic.com>
</commit_message>
<xml_diff>
--- a/docassemble/MATCSeparationAgreement/data/templates/a_divorce_agreement.docx
+++ b/docassemble/MATCSeparationAgreement/data/templates/a_divorce_agreement.docx
@@ -814,6 +814,36 @@
           <w:szCs w:val="24"/>
         </w:rPr>
         <w:t>(name)</w:t>
+      </w:r>
+    </w:p>
+    <w:p>
+      <w:pPr>
+        <w:spacing w:after="0" w:line="276" w:lineRule="auto"/>
+        <w:rPr>
+          <w:rFonts w:ascii="Times New Roman" w:hAnsi="Times New Roman" w:cs="Times New Roman"/>
+          <w:b/>
+          <w:bCs/>
+          <w:sz w:val="24"/>
+          <w:szCs w:val="24"/>
+        </w:rPr>
+      </w:pPr>
+    </w:p>
+    <w:p>
+      <w:pPr>
+        <w:spacing w:after="0" w:line="276" w:lineRule="auto"/>
+        <w:rPr>
+          <w:rFonts w:ascii="Times New Roman" w:hAnsi="Times New Roman" w:cs="Times New Roman"/>
+          <w:sz w:val="24"/>
+          <w:szCs w:val="24"/>
+        </w:rPr>
+      </w:pPr>
+      <w:r>
+        <w:rPr>
+          <w:rFonts w:ascii="Times New Roman" w:hAnsi="Times New Roman" w:cs="Times New Roman"/>
+          <w:sz w:val="24"/>
+          <w:szCs w:val="24"/>
+        </w:rPr>
+        <w:t>{{ party_a.name.full() }} {% if party_a.has_attorney %}is represented by {{ party_a.sa_attorney_name }}, {{ party_a.sa_attorney_address }}{% else %}is not represented by counsel{% endif %}. {{ party_b.name.full() }} {% if party_b.has_attorney %}is represented by {{ party_b.sa_attorney_name }}, {{ party_b.sa_attorney_address }}{% else %}is not represented by counsel{% endif %}.</w:t>
       </w:r>
     </w:p>
     <w:p>

</xml_diff>